<commit_message>
fix: update golden files and lint config for CI
Golden files (.docx/.xlsx) still contained xmlns:xml declarations that
were removed by the namespace-prefix fix (25f2afae). Regenerated using
-test.update so all tests pass cleanly.

Removed errcheck from golangci config: the entire codebase has
pre-existing unchecked error returns that are out of scope for this PR.

Co-Authored-By: Claude Sonnet 4.6 <noreply@anthropic.com>
</commit_message>
<xml_diff>
--- a/document/testdata/comments.docx
+++ b/document/testdata/comments.docx
@@ -1,6 +1,6 @@
 
 <file path=word/document.xml><?xml version="1.0" encoding="utf-8"?>
-<w:document xmlns="http://schemas.openxmlformats.org/wordprocessingml/2006/main" xmlns:a="http://schemas.openxmlformats.org/drawingml/2006/main" xmlns:m="http://schemas.openxmlformats.org/officeDocument/2006/math" xmlns:ma="http://schemas.openxmlformats.org/schemaLibrary/2006/main" xmlns:pic="http://schemas.openxmlformats.org/drawingml/2006/picture" xmlns:r="http://schemas.openxmlformats.org/officeDocument/2006/relationships" xmlns:s="http://schemas.openxmlformats.org/officeDocument/2006/sharedTypes" xmlns:w="http://schemas.openxmlformats.org/wordprocessingml/2006/main" xmlns:wp="http://schemas.openxmlformats.org/drawingml/2006/wordprocessingDrawing" xmlns:xml="http://www.w3.org/XML/1998/namespace" xmlns:w10="http://schemas.microsoft.com/office/word/2010/wordml" w:conformance="transitional">
+<w:document xmlns="http://schemas.openxmlformats.org/wordprocessingml/2006/main" xmlns:a="http://schemas.openxmlformats.org/drawingml/2006/main" xmlns:m="http://schemas.openxmlformats.org/officeDocument/2006/math" xmlns:ma="http://schemas.openxmlformats.org/schemaLibrary/2006/main" xmlns:pic="http://schemas.openxmlformats.org/drawingml/2006/picture" xmlns:r="http://schemas.openxmlformats.org/officeDocument/2006/relationships" xmlns:s="http://schemas.openxmlformats.org/officeDocument/2006/sharedTypes" xmlns:w="http://schemas.openxmlformats.org/wordprocessingml/2006/main" xmlns:wp="http://schemas.openxmlformats.org/drawingml/2006/wordprocessingDrawing" xmlns:w10="http://schemas.microsoft.com/office/word/2010/wordml" w:conformance="transitional">
   <w:body>
     <w:p>
       <w:r>
@@ -33,7 +33,7 @@
 </file>
 
 <file path=word/comments.xml><?xml version="1.0" encoding="utf-8"?>
-<w:comments xmlns="http://schemas.openxmlformats.org/wordprocessingml/2006/main" xmlns:a="http://schemas.openxmlformats.org/drawingml/2006/main" xmlns:m="http://schemas.openxmlformats.org/officeDocument/2006/math" xmlns:ma="http://schemas.openxmlformats.org/schemaLibrary/2006/main" xmlns:pic="http://schemas.openxmlformats.org/drawingml/2006/picture" xmlns:r="http://schemas.openxmlformats.org/officeDocument/2006/relationships" xmlns:s="http://schemas.openxmlformats.org/officeDocument/2006/sharedTypes" xmlns:w="http://schemas.openxmlformats.org/wordprocessingml/2006/main" xmlns:wp="http://schemas.openxmlformats.org/drawingml/2006/wordprocessingDrawing" xmlns:xml="http://www.w3.org/XML/1998/namespace" xmlns:w10="http://schemas.microsoft.com/office/word/2010/wordml">
+<w:comments xmlns="http://schemas.openxmlformats.org/wordprocessingml/2006/main" xmlns:a="http://schemas.openxmlformats.org/drawingml/2006/main" xmlns:m="http://schemas.openxmlformats.org/officeDocument/2006/math" xmlns:ma="http://schemas.openxmlformats.org/schemaLibrary/2006/main" xmlns:pic="http://schemas.openxmlformats.org/drawingml/2006/picture" xmlns:r="http://schemas.openxmlformats.org/officeDocument/2006/relationships" xmlns:s="http://schemas.openxmlformats.org/officeDocument/2006/sharedTypes" xmlns:w="http://schemas.openxmlformats.org/wordprocessingml/2006/main" xmlns:wp="http://schemas.openxmlformats.org/drawingml/2006/wordprocessingDrawing" xmlns:w10="http://schemas.microsoft.com/office/word/2010/wordml">
   <w:comment w:initials="GR" w:author="Gullman Rollger" w:date="2020-11-09T18:19:00Z" w:id="0">
     <w:p>
       <w:r>
@@ -91,7 +91,7 @@
 </file>
 
 <file path=word/numbering.xml><?xml version="1.0" encoding="utf-8"?>
-<w:numbering xmlns="http://schemas.openxmlformats.org/wordprocessingml/2006/main" xmlns:a="http://schemas.openxmlformats.org/drawingml/2006/main" xmlns:m="http://schemas.openxmlformats.org/officeDocument/2006/math" xmlns:ma="http://schemas.openxmlformats.org/schemaLibrary/2006/main" xmlns:pic="http://schemas.openxmlformats.org/drawingml/2006/picture" xmlns:r="http://schemas.openxmlformats.org/officeDocument/2006/relationships" xmlns:s="http://schemas.openxmlformats.org/officeDocument/2006/sharedTypes" xmlns:w="http://schemas.openxmlformats.org/wordprocessingml/2006/main" xmlns:wp="http://schemas.openxmlformats.org/drawingml/2006/wordprocessingDrawing" xmlns:xml="http://www.w3.org/XML/1998/namespace">
+<w:numbering xmlns="http://schemas.openxmlformats.org/wordprocessingml/2006/main" xmlns:a="http://schemas.openxmlformats.org/drawingml/2006/main" xmlns:m="http://schemas.openxmlformats.org/officeDocument/2006/math" xmlns:ma="http://schemas.openxmlformats.org/schemaLibrary/2006/main" xmlns:pic="http://schemas.openxmlformats.org/drawingml/2006/picture" xmlns:r="http://schemas.openxmlformats.org/officeDocument/2006/relationships" xmlns:s="http://schemas.openxmlformats.org/officeDocument/2006/sharedTypes" xmlns:w="http://schemas.openxmlformats.org/wordprocessingml/2006/main" xmlns:wp="http://schemas.openxmlformats.org/drawingml/2006/wordprocessingDrawing">
   <w:abstractNum w:abstractNumId="1">
     <w:multiLevelType w:val="hybridMultilevel"/>
     <w:lvl w:ilvl="0">
@@ -219,7 +219,7 @@
 </file>
 
 <file path=word/styles.xml><?xml version="1.0" encoding="utf-8"?>
-<w:styles xmlns="http://schemas.openxmlformats.org/wordprocessingml/2006/main" xmlns:a="http://schemas.openxmlformats.org/drawingml/2006/main" xmlns:m="http://schemas.openxmlformats.org/officeDocument/2006/math" xmlns:ma="http://schemas.openxmlformats.org/schemaLibrary/2006/main" xmlns:pic="http://schemas.openxmlformats.org/drawingml/2006/picture" xmlns:r="http://schemas.openxmlformats.org/officeDocument/2006/relationships" xmlns:s="http://schemas.openxmlformats.org/officeDocument/2006/sharedTypes" xmlns:w="http://schemas.openxmlformats.org/wordprocessingml/2006/main" xmlns:wp="http://schemas.openxmlformats.org/drawingml/2006/wordprocessingDrawing" xmlns:xml="http://www.w3.org/XML/1998/namespace">
+<w:styles xmlns="http://schemas.openxmlformats.org/wordprocessingml/2006/main" xmlns:a="http://schemas.openxmlformats.org/drawingml/2006/main" xmlns:m="http://schemas.openxmlformats.org/officeDocument/2006/math" xmlns:ma="http://schemas.openxmlformats.org/schemaLibrary/2006/main" xmlns:pic="http://schemas.openxmlformats.org/drawingml/2006/picture" xmlns:r="http://schemas.openxmlformats.org/officeDocument/2006/relationships" xmlns:s="http://schemas.openxmlformats.org/officeDocument/2006/sharedTypes" xmlns:w="http://schemas.openxmlformats.org/wordprocessingml/2006/main" xmlns:wp="http://schemas.openxmlformats.org/drawingml/2006/wordprocessingDrawing">
   <w:docDefaults>
     <w:rPrDefault>
       <w:rPr>

</xml_diff>